<commit_message>
feat: add 'kedaluwarsa' status to pengingat_jurnals and update related documentation
- Introduced a new status 'kedaluwarsa' for journal reminders to differentiate between reminders that were skipped because the teacher filled out the journal in time and those that expired due to the teaching day passing.
- Updated documentation to clarify the behavior of reminders on school activity days and the implications of the new status.
- Enhanced the user interface to reflect the new status in notifications and settings.
- Implemented a controller to securely serve protected files related to student discipline, ensuring they are only accessible to authenticated users.
- Adjusted database migration to accommodate the new status in the pengingat_jurnals table.
</commit_message>
<xml_diff>
--- a/docs/Panduan-SIM-SPENGA.docx
+++ b/docs/Panduan-SIM-SPENGA.docx
@@ -6961,6 +6961,287 @@
           </w:p>
         </w:tc>
       </w:tr>
+      <w:tr>
+        <w:tc>
+          <w:tcPr>
+            <w:tcW w:w="1500" w:type="pct"/>
+            <w:shd w:val="clear" w:fill="F7F9FC"/>
+          </w:tcPr>
+          <w:p>
+            <w:pPr>
+              <w:spacing w:after="0"/>
+            </w:pPr>
+            <w:r>
+              <w:rPr>
+                <w:b/>
+                <w:sz w:val="19"/>
+              </w:rPr>
+              <w:t xml:space="preserve">Hari Kegiatan Sekolah dikecualikan</w:t>
+            </w:r>
+          </w:p>
+        </w:tc>
+        <w:tc>
+          <w:tcPr>
+            <w:tcW w:w="3500" w:type="pct"/>
+            <w:shd w:val="clear" w:fill="F7F9FC"/>
+          </w:tcPr>
+          <w:p>
+            <w:pPr>
+              <w:spacing w:after="0"/>
+            </w:pPr>
+            <w:r>
+              <w:rPr>
+                <w:sz w:val="19"/>
+              </w:rPr>
+              <w:t xml:space="preserve">Pada hari lomba, classmeeting, tryout, atau pesantren, KBM biasa tidak berjalan — kehadiran diisi </w:t>
+            </w:r>
+            <w:r>
+              <w:rPr>
+                <w:b/>
+                <w:sz w:val="19"/>
+              </w:rPr>
+              <w:t xml:space="preserve">wali kelas</w:t>
+            </w:r>
+            <w:r>
+              <w:rPr>
+                <w:sz w:val="19"/>
+              </w:rPr>
+              <w:t xml:space="preserve"> lewat Absensi Kegiatan. Guru mata pelajaran tidak diingatkan sama sekali untuk kelas yang sedang berkegiatan.</w:t>
+            </w:r>
+          </w:p>
+        </w:tc>
+      </w:tr>
+      <w:tr>
+        <w:tc>
+          <w:tcPr>
+            <w:tcW w:w="1500" w:type="pct"/>
+          </w:tcPr>
+          <w:p>
+            <w:pPr>
+              <w:spacing w:after="0"/>
+            </w:pPr>
+            <w:r>
+              <w:rPr>
+                <w:b/>
+                <w:sz w:val="19"/>
+              </w:rPr>
+              <w:t xml:space="preserve">Tidak pernah menyusul ke hari berikutnya</w:t>
+            </w:r>
+          </w:p>
+        </w:tc>
+        <w:tc>
+          <w:tcPr>
+            <w:tcW w:w="3500" w:type="pct"/>
+          </w:tcPr>
+          <w:p>
+            <w:pPr>
+              <w:spacing w:after="0"/>
+            </w:pPr>
+            <w:r>
+              <w:rPr>
+                <w:sz w:val="19"/>
+              </w:rPr>
+              <w:t xml:space="preserve">Pengingat hanya berlaku pada hari mengajarnya. Bila harinya keburu lewat sebelum pesannya sempat keluar, pesan itu </w:t>
+            </w:r>
+            <w:r>
+              <w:rPr>
+                <w:b/>
+                <w:sz w:val="19"/>
+              </w:rPr>
+              <w:t xml:space="preserve">dibatalkan</w:t>
+            </w:r>
+            <w:r>
+              <w:rPr>
+                <w:sz w:val="19"/>
+              </w:rPr>
+              <w:t xml:space="preserve"> dan ditandai Kedaluwarsa — bukan dikirim terlambat.</w:t>
+            </w:r>
+          </w:p>
+        </w:tc>
+      </w:tr>
+    </w:tbl>
+    <w:p>
+      <w:pPr>
+        <w:spacing w:after="140"/>
+      </w:pPr>
+    </w:p>
+    <w:tbl>
+      <w:tblPr>
+        <w:tblW w:w="5000" w:type="pct"/>
+        <w:tblBorders>
+          <w:top w:val="single" w:sz="4" w:color="E0C878"/>
+          <w:left w:val="single" w:sz="18" w:color="E0A800"/>
+          <w:bottom w:val="single" w:sz="4" w:color="E0C878"/>
+          <w:right w:val="single" w:sz="4" w:color="E0C878"/>
+        </w:tblBorders>
+        <w:tblCellMar>
+          <w:top w:w="140" w:type="dxa"/>
+          <w:left w:w="200" w:type="dxa"/>
+          <w:bottom w:w="140" w:type="dxa"/>
+          <w:right w:w="200" w:type="dxa"/>
+        </w:tblCellMar>
+      </w:tblPr>
+      <w:tr>
+        <w:tc>
+          <w:tcPr>
+            <w:shd w:val="clear" w:fill="FFF4CE"/>
+          </w:tcPr>
+          <w:p>
+            <w:pPr>
+              <w:spacing w:after="60"/>
+            </w:pPr>
+            <w:r>
+              <w:rPr>
+                <w:b/>
+              </w:rPr>
+              <w:t xml:space="preserve">Cakupan kegiatan dihormati apa adanya</w:t>
+            </w:r>
+          </w:p>
+          <w:p>
+            <w:pPr>
+              <w:spacing w:after="0"/>
+              <w:jc w:val="both"/>
+            </w:pPr>
+            <w:r>
+              <w:t xml:space="preserve">Kegiatan yang hanya untuk kelas 7 </w:t>
+            </w:r>
+            <w:r>
+              <w:rPr>
+                <w:b/>
+              </w:rPr>
+              <w:t xml:space="preserve">tidak</w:t>
+            </w:r>
+            <w:r>
+              <w:t xml:space="preserve"> membebaskan kelas 8 dan 9 — guru yang mengajar kelas 8 hari itu tetap diingatkan seperti biasa. Begitu pula kegiatan yang hanya berlaku pada hari tertentu (mis. lomba tiap Sabtu selama Agustus): di luar hari itu pengingat berjalan normal. Kegiatan yang statusnya </w:t>
+            </w:r>
+            <w:r>
+              <w:rPr>
+                <w:b/>
+              </w:rPr>
+              <w:t xml:space="preserve">Nonaktif</w:t>
+            </w:r>
+            <w:r>
+              <w:t xml:space="preserve"> tidak membebaskan siapa pun.</w:t>
+            </w:r>
+          </w:p>
+        </w:tc>
+      </w:tr>
+    </w:tbl>
+    <w:p>
+      <w:pPr>
+        <w:spacing w:after="140"/>
+      </w:pPr>
+    </w:p>
+    <w:tbl>
+      <w:tblPr>
+        <w:tblW w:w="5000" w:type="pct"/>
+        <w:tblBorders>
+          <w:top w:val="single" w:sz="4" w:color="E0C878"/>
+          <w:left w:val="single" w:sz="18" w:color="E0A800"/>
+          <w:bottom w:val="single" w:sz="4" w:color="E0C878"/>
+          <w:right w:val="single" w:sz="4" w:color="E0C878"/>
+        </w:tblBorders>
+        <w:tblCellMar>
+          <w:top w:w="140" w:type="dxa"/>
+          <w:left w:w="200" w:type="dxa"/>
+          <w:bottom w:w="140" w:type="dxa"/>
+          <w:right w:w="200" w:type="dxa"/>
+        </w:tblCellMar>
+      </w:tblPr>
+      <w:tr>
+        <w:tc>
+          <w:tcPr>
+            <w:shd w:val="clear" w:fill="FFF4CE"/>
+          </w:tcPr>
+          <w:p>
+            <w:pPr>
+              <w:spacing w:after="60"/>
+            </w:pPr>
+            <w:r>
+              <w:rPr>
+                <w:b/>
+              </w:rPr>
+              <w:t xml:space="preserve">Kegiatan yang baru dicatat setelah berjalan tetap terkejar</w:t>
+            </w:r>
+          </w:p>
+          <w:p>
+            <w:pPr>
+              <w:spacing w:after="0"/>
+              <w:jc w:val="both"/>
+            </w:pPr>
+            <w:r>
+              <w:t xml:space="preserve">Kesiswaan sering baru memasukkan kegiatannya ke aplikasi setelah acaranya dimulai — misalnya lomba mulai pukul 07.00 tetapi baru diinput pukul 10.00. Pengingat untuk jam-jam pertama mungkin sudah terlanjur masuk antrian. Sistem memeriksa ulang tepat sebelum pesannya keluar, jadi pesan itu </w:t>
+            </w:r>
+            <w:r>
+              <w:rPr>
+                <w:b/>
+              </w:rPr>
+              <w:t xml:space="preserve">dibatalkan</w:t>
+            </w:r>
+            <w:r>
+              <w:t xml:space="preserve"> dan ditandai Dilewati. Guru tidak akan menerima teguran untuk hari yang KBM-nya memang ditiadakan.</w:t>
+            </w:r>
+          </w:p>
+        </w:tc>
+      </w:tr>
+    </w:tbl>
+    <w:p>
+      <w:pPr>
+        <w:spacing w:after="140"/>
+      </w:pPr>
+    </w:p>
+    <w:tbl>
+      <w:tblPr>
+        <w:tblW w:w="5000" w:type="pct"/>
+        <w:tblBorders>
+          <w:top w:val="single" w:sz="4" w:color="E0C878"/>
+          <w:left w:val="single" w:sz="18" w:color="E0A800"/>
+          <w:bottom w:val="single" w:sz="4" w:color="E0C878"/>
+          <w:right w:val="single" w:sz="4" w:color="E0C878"/>
+        </w:tblBorders>
+        <w:tblCellMar>
+          <w:top w:w="140" w:type="dxa"/>
+          <w:left w:w="200" w:type="dxa"/>
+          <w:bottom w:w="140" w:type="dxa"/>
+          <w:right w:w="200" w:type="dxa"/>
+        </w:tblCellMar>
+      </w:tblPr>
+      <w:tr>
+        <w:tc>
+          <w:tcPr>
+            <w:shd w:val="clear" w:fill="FFF4CE"/>
+          </w:tcPr>
+          <w:p>
+            <w:pPr>
+              <w:spacing w:after="60"/>
+            </w:pPr>
+            <w:r>
+              <w:rPr>
+                <w:b/>
+              </w:rPr>
+              <w:t xml:space="preserve">Kenapa tidak boleh menyusul keesokan harinya</w:t>
+            </w:r>
+          </w:p>
+          <w:p>
+            <w:pPr>
+              <w:spacing w:after="0"/>
+              <w:jc w:val="both"/>
+            </w:pPr>
+            <w:r>
+              <w:t xml:space="preserve">Pengingat itu cepat basi. Gunanya menyuruh guru mengisi jurnal </w:t>
+            </w:r>
+            <w:r>
+              <w:rPr>
+                <w:b/>
+              </w:rPr>
+              <w:t xml:space="preserve">selagi ingatannya masih segar</w:t>
+            </w:r>
+            <w:r>
+              <w:t xml:space="preserve"> dan datanya masih bisa dipertanggungjawabkan. Sesudah harinya lewat, pesan yang sama berubah sifat: bukan lagi pengingat, melainkan teguran atas sesuatu yang sudah tidak bisa diperbaiki hari itu juga — dan yang paling buruk, bisa tiba pada hari libur atau pagi-pagi keesokan harinya. Pengingat semacam itu justru membuat seluruh fiturnya mulai diabaikan guru.</w:t>
+            </w:r>
+          </w:p>
+        </w:tc>
+      </w:tr>
     </w:tbl>
     <w:p>
       <w:pPr>
@@ -8021,7 +8302,7 @@
               <w:rPr>
                 <w:sz w:val="19"/>
               </w:rPr>
-              <w:t xml:space="preserve">Guru keburu mengisi jurnalnya, atau pengingat dimatikan sebelum terkirim</w:t>
+              <w:t xml:space="preserve">Guru keburu mengisi jurnalnya, kelasnya sedang ada Kegiatan Sekolah, atau pengingat dimatikan sebelum terkirim. Kolom Keterangan menyebut yang mana</w:t>
             </w:r>
           </w:p>
         </w:tc>
@@ -8104,6 +8385,120 @@
                 <w:sz w:val="19"/>
               </w:rPr>
               <w:t xml:space="preserve"> pada barisnya</w:t>
+            </w:r>
+          </w:p>
+        </w:tc>
+      </w:tr>
+      <w:tr>
+        <w:tc>
+          <w:tcPr>
+            <w:tcW w:w="800" w:type="pct"/>
+          </w:tcPr>
+          <w:p>
+            <w:pPr>
+              <w:spacing w:after="0"/>
+            </w:pPr>
+            <w:r>
+              <w:rPr>
+                <w:sz w:val="19"/>
+              </w:rPr>
+              <w:t xml:space="preserve">Kedaluwarsa</w:t>
+            </w:r>
+          </w:p>
+        </w:tc>
+        <w:tc>
+          <w:tcPr>
+            <w:tcW w:w="2200" w:type="pct"/>
+          </w:tcPr>
+          <w:p>
+            <w:pPr>
+              <w:spacing w:after="0"/>
+            </w:pPr>
+            <w:r>
+              <w:rPr>
+                <w:sz w:val="19"/>
+              </w:rPr>
+              <w:t xml:space="preserve">Hari mengajarnya sudah lewat sebelum pesannya sempat keluar dari antrian</w:t>
+            </w:r>
+          </w:p>
+        </w:tc>
+        <w:tc>
+          <w:tcPr>
+            <w:tcW w:w="2000" w:type="pct"/>
+          </w:tcPr>
+          <w:p>
+            <w:pPr>
+              <w:spacing w:after="0"/>
+            </w:pPr>
+            <w:r>
+              <w:rPr>
+                <w:sz w:val="19"/>
+              </w:rPr>
+              <w:t xml:space="preserve">Ini pertanda pekerja antrian di server sempat mati. Periksa servernya — jurnal yang bersangkutan kemungkinan besar memang belum terisi</w:t>
+            </w:r>
+          </w:p>
+        </w:tc>
+      </w:tr>
+    </w:tbl>
+    <w:p>
+      <w:pPr>
+        <w:spacing w:after="140"/>
+      </w:pPr>
+    </w:p>
+    <w:tbl>
+      <w:tblPr>
+        <w:tblW w:w="5000" w:type="pct"/>
+        <w:tblBorders>
+          <w:top w:val="single" w:sz="4" w:color="E0C878"/>
+          <w:left w:val="single" w:sz="18" w:color="E0A800"/>
+          <w:bottom w:val="single" w:sz="4" w:color="E0C878"/>
+          <w:right w:val="single" w:sz="4" w:color="E0C878"/>
+        </w:tblBorders>
+        <w:tblCellMar>
+          <w:top w:w="140" w:type="dxa"/>
+          <w:left w:w="200" w:type="dxa"/>
+          <w:bottom w:w="140" w:type="dxa"/>
+          <w:right w:w="200" w:type="dxa"/>
+        </w:tblCellMar>
+      </w:tblPr>
+      <w:tr>
+        <w:tc>
+          <w:tcPr>
+            <w:shd w:val="clear" w:fill="FFF4CE"/>
+          </w:tcPr>
+          <w:p>
+            <w:pPr>
+              <w:spacing w:after="60"/>
+            </w:pPr>
+            <w:r>
+              <w:rPr>
+                <w:b/>
+              </w:rPr>
+              <w:t xml:space="preserve">Beda "Dilewati" dan "Kedaluwarsa" — keduanya sama-sama tidak dikirim</w:t>
+            </w:r>
+          </w:p>
+          <w:p>
+            <w:pPr>
+              <w:spacing w:after="0"/>
+              <w:jc w:val="both"/>
+            </w:pPr>
+            <w:r>
+              <w:rPr>
+                <w:b/>
+              </w:rPr>
+              <w:t xml:space="preserve">Dilewati</w:t>
+            </w:r>
+            <w:r>
+              <w:t xml:space="preserve"> adalah kabar baik: gurunya sudah mengisi jurnal, jadi tidak perlu diganggu. </w:t>
+            </w:r>
+            <w:r>
+              <w:rPr>
+                <w:b/>
+              </w:rPr>
+              <w:t xml:space="preserve">Kedaluwarsa</w:t>
+            </w:r>
+            <w:r>
+              <w:t xml:space="preserve"> adalah kabar buruk: jurnalnya kemungkinan besar masih kosong, tetapi pesannya sudah telanjur basi karena harinya lewat. Bila angka Kedaluwarsa mulai banyak, yang bermasalah bukan gurunya melainkan servernya — lihat E.6.</w:t>
             </w:r>
           </w:p>
         </w:tc>
@@ -8445,6 +8840,49 @@
           </w:p>
         </w:tc>
       </w:tr>
+      <w:tr>
+        <w:tc>
+          <w:tcPr>
+            <w:tcW w:w="2250" w:type="pct"/>
+            <w:shd w:val="clear" w:fill="F7F9FC"/>
+          </w:tcPr>
+          <w:p>
+            <w:pPr>
+              <w:spacing w:after="0"/>
+            </w:pPr>
+            <w:r>
+              <w:rPr>
+                <w:sz w:val="19"/>
+              </w:rPr>
+              <w:t xml:space="preserve">Banyak berstatus </w:t>
+            </w:r>
+            <w:r>
+              <w:rPr>
+                <w:b/>
+                <w:sz w:val="19"/>
+              </w:rPr>
+              <w:t xml:space="preserve">Kedaluwarsa</w:t>
+            </w:r>
+          </w:p>
+        </w:tc>
+        <w:tc>
+          <w:tcPr>
+            <w:tcW w:w="2750" w:type="pct"/>
+            <w:shd w:val="clear" w:fill="F7F9FC"/>
+          </w:tcPr>
+          <w:p>
+            <w:pPr>
+              <w:spacing w:after="0"/>
+            </w:pPr>
+            <w:r>
+              <w:rPr>
+                <w:sz w:val="19"/>
+              </w:rPr>
+              <w:t xml:space="preserve">Pekerja antrian sempat mati berjam-jam atau semalaman, sehingga pesannya baru diproses setelah harinya lewat</w:t>
+            </w:r>
+          </w:p>
+        </w:tc>
+      </w:tr>
     </w:tbl>
     <w:p>
       <w:pPr>
@@ -11112,18 +11550,124 @@
         <w:jc w:val="both"/>
       </w:pPr>
       <w:r>
-        <w:t xml:space="preserve">Cadangkan juga folder </w:t>
+        <w:t xml:space="preserve">Cadangkan juga seluruh folder </w:t>
       </w:r>
       <w:r>
         <w:rPr>
           <w:rFonts w:ascii="Consolas" w:hAnsi="Consolas"/>
           <w:color w:val="B03060"/>
         </w:rPr>
-        <w:t xml:space="preserve">storage/app/public</w:t>
-      </w:r>
-      <w:r>
-        <w:t xml:space="preserve"> yang berisi berkas unggahan: logo sekolah, ikon aplikasi, bukti pelanggaran &amp; pembinaan BK, dan lampiran surat. Database saja belum lengkap — bila foldernya tidak ikut, catatan BK akan pulih tanpa foto buktinya dan kop surat kehilangan logonya.</w:t>
-      </w:r>
+        <w:t xml:space="preserve">storage/app</w:t>
+      </w:r>
+      <w:r>
+        <w:t xml:space="preserve"> yang berisi berkas unggahan. Di dalamnya ada </w:t>
+      </w:r>
+      <w:r>
+        <w:rPr>
+          <w:b/>
+        </w:rPr>
+        <w:t xml:space="preserve">dua</w:t>
+      </w:r>
+      <w:r>
+        <w:t xml:space="preserve"> folder dan keduanya sama-sama wajib: </w:t>
+      </w:r>
+      <w:r>
+        <w:rPr>
+          <w:rFonts w:ascii="Consolas" w:hAnsi="Consolas"/>
+          <w:color w:val="B03060"/>
+        </w:rPr>
+        <w:t xml:space="preserve">public</w:t>
+      </w:r>
+      <w:r>
+        <w:t xml:space="preserve"> (logo sekolah &amp; ikon aplikasi) dan </w:t>
+      </w:r>
+      <w:r>
+        <w:rPr>
+          <w:rFonts w:ascii="Consolas" w:hAnsi="Consolas"/>
+          <w:color w:val="B03060"/>
+        </w:rPr>
+        <w:t xml:space="preserve">private</w:t>
+      </w:r>
+      <w:r>
+        <w:t xml:space="preserve"> (foto bukti pelanggaran &amp; pembinaan BK, serta lampiran surat). Database saja belum lengkap — bila foldernya tidak ikut, catatan BK akan pulih tanpa foto buktinya dan kop surat kehilangan logonya.</w:t>
+      </w:r>
+    </w:p>
+    <w:tbl>
+      <w:tblPr>
+        <w:tblW w:w="5000" w:type="pct"/>
+        <w:tblBorders>
+          <w:top w:val="single" w:sz="4" w:color="E0C878"/>
+          <w:left w:val="single" w:sz="18" w:color="E0A800"/>
+          <w:bottom w:val="single" w:sz="4" w:color="E0C878"/>
+          <w:right w:val="single" w:sz="4" w:color="E0C878"/>
+        </w:tblBorders>
+        <w:tblCellMar>
+          <w:top w:w="140" w:type="dxa"/>
+          <w:left w:w="200" w:type="dxa"/>
+          <w:bottom w:w="140" w:type="dxa"/>
+          <w:right w:w="200" w:type="dxa"/>
+        </w:tblCellMar>
+      </w:tblPr>
+      <w:tr>
+        <w:tc>
+          <w:tcPr>
+            <w:shd w:val="clear" w:fill="FFF4CE"/>
+          </w:tcPr>
+          <w:p>
+            <w:pPr>
+              <w:spacing w:after="60"/>
+            </w:pPr>
+            <w:r>
+              <w:rPr>
+                <w:b/>
+              </w:rPr>
+              <w:t xml:space="preserve">Kenapa berkas BK terpisah di folder </w:t>
+            </w:r>
+            <w:r>
+              <w:rPr>
+                <w:b/>
+                <w:rFonts w:ascii="Consolas" w:hAnsi="Consolas"/>
+                <w:color w:val="B03060"/>
+              </w:rPr>
+              <w:t xml:space="preserve">private</w:t>
+            </w:r>
+          </w:p>
+          <w:p>
+            <w:pPr>
+              <w:spacing w:after="0"/>
+              <w:jc w:val="both"/>
+            </w:pPr>
+            <w:r>
+              <w:t xml:space="preserve">Berkas di </w:t>
+            </w:r>
+            <w:r>
+              <w:rPr>
+                <w:rFonts w:ascii="Consolas" w:hAnsi="Consolas"/>
+                <w:color w:val="B03060"/>
+              </w:rPr>
+              <w:t xml:space="preserve">public</w:t>
+            </w:r>
+            <w:r>
+              <w:t xml:space="preserve"> dilayani langsung oleh peladen web, tanpa pemeriksaan login — itu memang perlu untuk logo, yang harus tampil di halaman masuk. Foto bukti pelanggaran siswa tidak boleh begitu: siapa pun yang memegang alamatnya akan bisa membukanya selamanya, bahkan setelah tidak lagi bekerja di sekolah. Karena itu berkas rahasia disimpan di </w:t>
+            </w:r>
+            <w:r>
+              <w:rPr>
+                <w:rFonts w:ascii="Consolas" w:hAnsi="Consolas"/>
+                <w:color w:val="B03060"/>
+              </w:rPr>
+              <w:t xml:space="preserve">private</w:t>
+            </w:r>
+            <w:r>
+              <w:t xml:space="preserve">, di luar jangkauan peladen web, dan hanya bisa dibuka lewat aplikasi oleh pengguna yang sudah masuk.</w:t>
+            </w:r>
+          </w:p>
+        </w:tc>
+      </w:tr>
+    </w:tbl>
+    <w:p>
+      <w:pPr>
+        <w:spacing w:after="140"/>
+      </w:pPr>
     </w:p>
     <w:tbl>
       <w:tblPr>

</xml_diff>